<commit_message>
added docket number variable and trial court to match complaint
</commit_message>
<xml_diff>
--- a/docassemble/MAHousingTRO/data/templates/temporary_restraining_order.docx
+++ b/docassemble/MAHousingTRO/data/templates/temporary_restraining_order.docx
@@ -47,6 +47,12 @@
           <w:sz w:val="16"/>
         </w:rPr>
         <w:sectPr>
+          <w:headerReference w:type="default" r:id="rId10"/>
+          <w:headerReference w:type="first" r:id="rId11"/>
+          <w:headerReference w:type="even" r:id="rId12"/>
+          <w:footerReference w:type="default" r:id="rId13"/>
+          <w:footerReference w:type="first" r:id="rId14"/>
+          <w:footerReference w:type="even" r:id="rId15"/>
           <w:type w:val="continuous"/>
           <w:pgSz w:w="12240" w:h="15840" w:orient="portrait"/>
           <w:pgMar w:top="420" w:right="360" w:bottom="0" w:left="360" w:header="720" w:footer="720" w:gutter="0"/>
@@ -152,18 +158,47 @@
         <w:rPr>
           <w:b w:val="0"/>
         </w:rPr>
-        <w:br w:type="column"/>
-      </w:r>
-      <w:r>
-        <w:rPr>
-          <w:spacing w:val="-2"/>
-        </w:rPr>
-        <w:t>DIVISION</w:t>
-      </w:r>
-      <w:r>
-        <w:t xml:space="preserve">: </w:t>
+        <w:t xml:space="preserve">DIVISION: </w:t>
       </w:r>
       <w:proofErr w:type="gramStart"/>
+      <w:r>
+        <w:rPr>
+          <w:rStyle w:val="normaltextrun"/>
+          <w:b w:val="0"/>
+          <w:bCs w:val="0"/>
+          <w:color w:val="000000"/>
+          <w:sz w:val="20"/>
+          <w:szCs w:val="20"/>
+          <w:lang w:val="en-GB"/>
+        </w:rPr>
+        <w:t xml:space="preserve">{{ </w:t>
+      </w:r>
+      <w:r>
+        <w:rPr>
+          <w:rStyle w:val="normaltextrun"/>
+          <w:b w:val="0"/>
+          <w:bCs w:val="0"/>
+          <w:color w:val="000000"/>
+          <w:sz w:val="20"/>
+          <w:szCs w:val="20"/>
+          <w:lang w:val="en-GB"/>
+          <w:shd w:val="clear" w:color="auto" w:fill="C7E1DD"/>
+        </w:rPr>
+        <w:t>trial_court</w:t>
+      </w:r>
+      <w:r>
+        <w:rPr>
+          <w:rStyle w:val="normaltextrun"/>
+          <w:b w:val="0"/>
+          <w:bCs w:val="0"/>
+          <w:color w:val="000000"/>
+          <w:sz w:val="20"/>
+          <w:szCs w:val="20"/>
+          <w:lang w:val="en-GB"/>
+        </w:rPr>
+        <w:t xml:space="preserve"> }}</w:t>
+      </w:r>
+      <w:proofErr w:type="spellStart"/>
       <w:r>
         <w:rPr>
           <w:rStyle w:val="normaltextrun"/>
@@ -175,9 +210,8 @@
           <w:shd w:val="clear" w:color="auto" w:fill="FFFFFF"/>
           <w:lang w:val="en-GB"/>
         </w:rPr>
-        <w:t>{{ </w:t>
-      </w:r>
-      <w:proofErr w:type="spellStart"/>
+      </w:r>
+      <w:proofErr w:type="gramEnd"/>
       <w:r>
         <w:rPr>
           <w:rStyle w:val="normaltextrun"/>
@@ -189,9 +223,8 @@
           <w:shd w:val="clear" w:color="auto" w:fill="FFFFFF"/>
           <w:lang w:val="en-GB"/>
         </w:rPr>
-        <w:t>trial</w:t>
-      </w:r>
-      <w:proofErr w:type="gramEnd"/>
+      </w:r>
+      <w:proofErr w:type="gramStart"/>
       <w:r>
         <w:rPr>
           <w:rStyle w:val="normaltextrun"/>
@@ -203,9 +236,9 @@
           <w:shd w:val="clear" w:color="auto" w:fill="FFFFFF"/>
           <w:lang w:val="en-GB"/>
         </w:rPr>
-        <w:t>_</w:t>
-      </w:r>
-      <w:proofErr w:type="gramStart"/>
+      </w:r>
+      <w:proofErr w:type="spellEnd"/>
+      <w:proofErr w:type="gramEnd"/>
       <w:r>
         <w:rPr>
           <w:rStyle w:val="normaltextrun"/>
@@ -217,35 +250,6 @@
           <w:shd w:val="clear" w:color="auto" w:fill="FFFFFF"/>
           <w:lang w:val="en-GB"/>
         </w:rPr>
-        <w:t>court.division</w:t>
-      </w:r>
-      <w:proofErr w:type="spellEnd"/>
-      <w:proofErr w:type="gramEnd"/>
-      <w:r>
-        <w:rPr>
-          <w:rStyle w:val="normaltextrun"/>
-          <w:b w:val="0"/>
-          <w:bCs w:val="0"/>
-          <w:color w:val="000000"/>
-          <w:sz w:val="20"/>
-          <w:szCs w:val="20"/>
-          <w:shd w:val="clear" w:color="auto" w:fill="FFFFFF"/>
-          <w:lang w:val="en-GB"/>
-        </w:rPr>
-        <w:t xml:space="preserve"> </w:t>
-      </w:r>
-      <w:r>
-        <w:rPr>
-          <w:rStyle w:val="normaltextrun"/>
-          <w:b w:val="0"/>
-          <w:bCs w:val="0"/>
-          <w:color w:val="000000"/>
-          <w:sz w:val="20"/>
-          <w:szCs w:val="20"/>
-          <w:shd w:val="clear" w:color="auto" w:fill="FFFFFF"/>
-          <w:lang w:val="en-GB"/>
-        </w:rPr>
-        <w:t>}}</w:t>
       </w:r>
     </w:p>
     <w:p>
@@ -295,36 +299,41 @@
         </w:rPr>
         <w:t xml:space="preserve">{{ </w:t>
       </w:r>
-      <w:proofErr w:type="spellStart"/>
       <w:r>
         <w:rPr>
           <w:b w:val="0"/>
           <w:bCs w:val="0"/>
-        </w:rPr>
-        <w:t>civil</w:t>
-      </w:r>
-      <w:proofErr w:type="gramEnd"/>
+          <w:shd w:val="clear" w:color="auto" w:fill="C7E1DD"/>
+        </w:rPr>
+        <w:t>docket_number</w:t>
+      </w:r>
       <w:r>
         <w:rPr>
           <w:b w:val="0"/>
           <w:bCs w:val="0"/>
         </w:rPr>
-        <w:t>_action_number</w:t>
-      </w:r>
-      <w:proofErr w:type="spellEnd"/>
+        <w:t xml:space="preserve"> }}</w:t>
+      </w:r>
+      <w:proofErr w:type="spellStart"/>
       <w:r>
         <w:rPr>
           <w:b w:val="0"/>
           <w:bCs w:val="0"/>
         </w:rPr>
-        <w:t xml:space="preserve"> }</w:t>
-      </w:r>
+      </w:r>
+      <w:proofErr w:type="gramEnd"/>
       <w:r>
         <w:rPr>
           <w:b w:val="0"/>
           <w:bCs w:val="0"/>
         </w:rPr>
-        <w:t>}</w:t>
+      </w:r>
+      <w:proofErr w:type="spellEnd"/>
+      <w:r>
+        <w:rPr>
+          <w:b w:val="0"/>
+          <w:bCs w:val="0"/>
+        </w:rPr>
       </w:r>
     </w:p>
     <w:p>
@@ -369,205 +378,62 @@
       </w:r>
       <w:r>
         <w:rPr>
-          <w:rStyle w:val="normaltextrun"/>
-          <w:color w:val="000000"/>
-          <w:sz w:val="20"/>
-          <w:szCs w:val="20"/>
-          <w:shd w:val="clear" w:color="auto" w:fill="FFFFFF"/>
-          <w:lang w:val="en-GB"/>
-        </w:rPr>
-        <w:t>{{ plaintiffs</w:t>
-      </w:r>
-      <w:r>
-        <w:rPr>
-          <w:rStyle w:val="normaltextrun"/>
-          <w:color w:val="000000"/>
-          <w:sz w:val="20"/>
-          <w:szCs w:val="20"/>
-          <w:shd w:val="clear" w:color="auto" w:fill="FFFFFF"/>
-          <w:lang w:val="en-GB"/>
-        </w:rPr>
-        <w:t>[0].</w:t>
-      </w:r>
-      <w:r>
-        <w:rPr>
-          <w:rStyle w:val="normaltextrun"/>
-          <w:color w:val="000000"/>
-          <w:sz w:val="20"/>
-          <w:szCs w:val="20"/>
-          <w:shd w:val="clear" w:color="auto" w:fill="FFFFFF"/>
-          <w:lang w:val="en-GB"/>
-        </w:rPr>
-        <w:t>name.full</w:t>
-      </w:r>
-      <w:r>
-        <w:rPr>
-          <w:rStyle w:val="normaltextrun"/>
-          <w:color w:val="000000"/>
-          <w:sz w:val="20"/>
-          <w:szCs w:val="20"/>
-          <w:shd w:val="clear" w:color="auto" w:fill="FFFFFF"/>
-          <w:lang w:val="en-GB"/>
-        </w:rPr>
-        <w:t>(</w:t>
-      </w:r>
-      <w:r>
-        <w:rPr>
-          <w:rStyle w:val="normaltextrun"/>
-          <w:color w:val="000000"/>
-          <w:sz w:val="20"/>
-          <w:szCs w:val="20"/>
-          <w:shd w:val="clear" w:color="auto" w:fill="FFFFFF"/>
-          <w:lang w:val="en-GB"/>
-        </w:rPr>
-        <w:t>) }</w:t>
-      </w:r>
-      <w:r>
-        <w:rPr>
-          <w:rStyle w:val="normaltextrun"/>
-          <w:color w:val="000000"/>
-          <w:sz w:val="20"/>
-          <w:szCs w:val="20"/>
-          <w:shd w:val="clear" w:color="auto" w:fill="FFFFFF"/>
-          <w:lang w:val="en-GB"/>
-        </w:rPr>
-        <w:t>}</w:t>
-      </w:r>
-      <w:r>
-        <w:rPr>
-          <w:rStyle w:val="normaltextrun"/>
-          <w:color w:val="000000"/>
-          <w:sz w:val="20"/>
-          <w:szCs w:val="20"/>
-          <w:shd w:val="clear" w:color="auto" w:fill="FFFFFF"/>
-          <w:lang w:val="en-GB"/>
-        </w:rPr>
-        <w:tab/>
-      </w:r>
-      <w:r>
-        <w:rPr>
-          <w:b w:val="1"/>
-          <w:bCs w:val="1"/>
           <w:sz w:val="18"/>
           <w:szCs w:val="18"/>
         </w:rPr>
-        <w:t>VS.</w:t>
-      </w:r>
-      <w:r>
-        <w:rPr>
-          <w:b w:val="1"/>
-          <w:bCs w:val="1"/>
-          <w:spacing w:val="126"/>
+        <w:t xml:space="preserve">{{ </w:t>
+      </w:r>
+      <w:r>
+        <w:rPr>
           <w:sz w:val="18"/>
           <w:szCs w:val="18"/>
-        </w:rPr>
-        <w:t xml:space="preserve">         </w:t>
-      </w:r>
-      <w:r>
-        <w:rPr>
-          <w:b w:val="1"/>
-          <w:bCs w:val="1"/>
-          <w:spacing w:val="126"/>
+          <w:shd w:val="clear" w:color="auto" w:fill="C7E1DD"/>
+        </w:rPr>
+        <w:t>plaintiffs[0].name.full()</w:t>
+      </w:r>
+      <w:r>
+        <w:rPr>
           <w:sz w:val="18"/>
           <w:szCs w:val="18"/>
         </w:rPr>
-        <w:t xml:space="preserve"> </w:t>
-      </w:r>
-      <w:r>
-        <w:rPr>
-          <w:b w:val="1"/>
-          <w:bCs w:val="1"/>
-          <w:spacing w:val="126"/>
+        <w:t xml:space="preserve"> }}</w:t>
+      </w:r>
+      <w:r>
+        <w:rPr>
           <w:sz w:val="18"/>
           <w:szCs w:val="18"/>
         </w:rPr>
-        <w:t xml:space="preserve">                   </w:t>
-      </w:r>
-      <w:r>
-        <w:rPr>
-          <w:rStyle w:val="normaltextrun"/>
-          <w:color w:val="000000"/>
-          <w:sz w:val="20"/>
-          <w:szCs w:val="20"/>
-          <w:shd w:val="clear" w:color="auto" w:fill="FFFFFF"/>
-          <w:lang w:val="en-GB"/>
-        </w:rPr>
-        <w:t xml:space="preserve">{</w:t>
-      </w:r>
-      <w:r>
-        <w:rPr>
-          <w:rStyle w:val="normaltextrun"/>
-          <w:color w:val="000000"/>
-          <w:sz w:val="20"/>
-          <w:szCs w:val="20"/>
-          <w:shd w:val="clear" w:color="auto" w:fill="FFFFFF"/>
-          <w:lang w:val="en-GB"/>
-        </w:rPr>
-        <w:t xml:space="preserve">{ defenda</w:t>
-      </w:r>
-      <w:r>
-        <w:rPr>
-          <w:rStyle w:val="normaltextrun"/>
-          <w:color w:val="000000"/>
-          <w:sz w:val="20"/>
-          <w:szCs w:val="20"/>
-          <w:shd w:val="clear" w:color="auto" w:fill="FFFFFF"/>
-          <w:lang w:val="en-GB"/>
-        </w:rPr>
-        <w:t xml:space="preserve">n</w:t>
-      </w:r>
-      <w:r>
-        <w:rPr>
-          <w:rStyle w:val="normaltextrun"/>
-          <w:color w:val="000000"/>
-          <w:sz w:val="20"/>
-          <w:szCs w:val="20"/>
-          <w:shd w:val="clear" w:color="auto" w:fill="FFFFFF"/>
-          <w:lang w:val="en-GB"/>
-        </w:rPr>
-        <w:t xml:space="preserve">ts[</w:t>
-      </w:r>
-      <w:r>
-        <w:rPr>
-          <w:rStyle w:val="normaltextrun"/>
-          <w:color w:val="000000"/>
-          <w:sz w:val="20"/>
-          <w:szCs w:val="20"/>
-          <w:shd w:val="clear" w:color="auto" w:fill="FFFFFF"/>
-          <w:lang w:val="en-GB"/>
-        </w:rPr>
-        <w:t xml:space="preserve">0].name.full() </w:t>
-      </w:r>
-      <w:r>
-        <w:rPr>
-          <w:rStyle w:val="normaltextrun"/>
-          <w:color w:val="000000"/>
-          <w:sz w:val="20"/>
-          <w:szCs w:val="20"/>
-          <w:shd w:val="clear" w:color="auto" w:fill="FFFFFF"/>
-          <w:lang w:val="en-GB"/>
-        </w:rPr>
-        <w:t>}}</w:t>
-      </w:r>
-      <w:r>
-        <w:rPr>
-          <w:rStyle w:val="eop"/>
-          <w:color w:val="000000"/>
-          <w:sz w:val="20"/>
-          <w:szCs w:val="20"/>
-          <w:shd w:val="clear" w:color="auto" w:fill="FFFFFF"/>
-        </w:rPr>
-        <w:t> </w:t>
-      </w:r>
-      <w:r>
-        <w:rPr>
-          <w:b w:val="1"/>
-          <w:bCs w:val="1"/>
-          <w:spacing w:val="126"/>
+        <w:tab/>
+        <w:t xml:space="preserve">VS.                             </w:t>
+      </w:r>
+      <w:r>
+        <w:rPr>
           <w:sz w:val="18"/>
           <w:szCs w:val="18"/>
         </w:rPr>
-        <w:t xml:space="preserve">      </w:t>
+        <w:t xml:space="preserve">{{ </w:t>
+      </w:r>
+      <w:r>
+        <w:rPr>
+          <w:sz w:val="18"/>
+          <w:szCs w:val="18"/>
+          <w:shd w:val="clear" w:color="auto" w:fill="C7E1DD"/>
+        </w:rPr>
+        <w:t>defendants[0].name.full()</w:t>
+      </w:r>
+      <w:r>
+        <w:rPr>
+          <w:sz w:val="18"/>
+          <w:szCs w:val="18"/>
+        </w:rPr>
+        <w:t xml:space="preserve"> }}</w:t>
+      </w:r>
+      <w:r>
+        <w:rPr>
+          <w:sz w:val="18"/>
+          <w:szCs w:val="18"/>
+        </w:rPr>
+        <w:t xml:space="preserve">       </w:t>
       </w:r>
     </w:p>
     <w:p>
@@ -1416,180 +1282,7 @@
           <w:position w:val="2"/>
           <w:sz w:val="18"/>
         </w:rPr>
-        <w:t>Signed</w:t>
-      </w:r>
-      <w:r>
-        <w:rPr>
-          <w:spacing w:val="-2"/>
-          <w:position w:val="2"/>
-          <w:sz w:val="18"/>
-        </w:rPr>
-        <w:t xml:space="preserve"> </w:t>
-      </w:r>
-      <w:r>
-        <w:rPr>
-          <w:position w:val="2"/>
-          <w:sz w:val="18"/>
-        </w:rPr>
-        <w:t>and</w:t>
-      </w:r>
-      <w:r>
-        <w:rPr>
-          <w:spacing w:val="-1"/>
-          <w:position w:val="2"/>
-          <w:sz w:val="18"/>
-        </w:rPr>
-        <w:t xml:space="preserve"> </w:t>
-      </w:r>
-      <w:r>
-        <w:rPr>
-          <w:position w:val="2"/>
-          <w:sz w:val="18"/>
-        </w:rPr>
-        <w:t>sworn</w:t>
-      </w:r>
-      <w:r>
-        <w:rPr>
-          <w:spacing w:val="-1"/>
-          <w:position w:val="2"/>
-          <w:sz w:val="18"/>
-        </w:rPr>
-        <w:t xml:space="preserve"> </w:t>
-      </w:r>
-      <w:r>
-        <w:rPr>
-          <w:position w:val="2"/>
-          <w:sz w:val="18"/>
-        </w:rPr>
-        <w:t>to</w:t>
-      </w:r>
-      <w:r>
-        <w:rPr>
-          <w:spacing w:val="-1"/>
-          <w:position w:val="2"/>
-          <w:sz w:val="18"/>
-        </w:rPr>
-        <w:t xml:space="preserve"> </w:t>
-      </w:r>
-      <w:r>
-        <w:rPr>
-          <w:position w:val="2"/>
-          <w:sz w:val="18"/>
-        </w:rPr>
-        <w:t>under</w:t>
-      </w:r>
-      <w:r>
-        <w:rPr>
-          <w:spacing w:val="-1"/>
-          <w:position w:val="2"/>
-          <w:sz w:val="18"/>
-        </w:rPr>
-        <w:t xml:space="preserve"> </w:t>
-      </w:r>
-      <w:r>
-        <w:rPr>
-          <w:position w:val="2"/>
-          <w:sz w:val="18"/>
-        </w:rPr>
-        <w:t>the</w:t>
-      </w:r>
-      <w:r>
-        <w:rPr>
-          <w:spacing w:val="-2"/>
-          <w:position w:val="2"/>
-          <w:sz w:val="18"/>
-        </w:rPr>
-        <w:t xml:space="preserve"> </w:t>
-      </w:r>
-      <w:r>
-        <w:rPr>
-          <w:position w:val="2"/>
-          <w:sz w:val="18"/>
-        </w:rPr>
-        <w:t>pains</w:t>
-      </w:r>
-      <w:r>
-        <w:rPr>
-          <w:spacing w:val="-1"/>
-          <w:position w:val="2"/>
-          <w:sz w:val="18"/>
-        </w:rPr>
-        <w:t xml:space="preserve"> </w:t>
-      </w:r>
-      <w:r>
-        <w:rPr>
-          <w:position w:val="2"/>
-          <w:sz w:val="18"/>
-        </w:rPr>
-        <w:t>and</w:t>
-      </w:r>
-      <w:r>
-        <w:rPr>
-          <w:spacing w:val="-1"/>
-          <w:position w:val="2"/>
-          <w:sz w:val="18"/>
-        </w:rPr>
-        <w:t xml:space="preserve"> </w:t>
-      </w:r>
-      <w:r>
-        <w:rPr>
-          <w:position w:val="2"/>
-          <w:sz w:val="18"/>
-        </w:rPr>
-        <w:t>penalties</w:t>
-      </w:r>
-      <w:r>
-        <w:rPr>
-          <w:spacing w:val="-1"/>
-          <w:position w:val="2"/>
-          <w:sz w:val="18"/>
-        </w:rPr>
-        <w:t xml:space="preserve"> </w:t>
-      </w:r>
-      <w:r>
-        <w:rPr>
-          <w:position w:val="2"/>
-          <w:sz w:val="18"/>
-        </w:rPr>
-        <w:t>of</w:t>
-      </w:r>
-      <w:r>
-        <w:rPr>
-          <w:spacing w:val="-1"/>
-          <w:position w:val="2"/>
-          <w:sz w:val="18"/>
-        </w:rPr>
-        <w:t xml:space="preserve"> </w:t>
-      </w:r>
-      <w:r>
-        <w:rPr>
-          <w:position w:val="2"/>
-          <w:sz w:val="18"/>
-        </w:rPr>
-        <w:t>perjury</w:t>
-      </w:r>
-      <w:r>
-        <w:rPr>
-          <w:spacing w:val="-2"/>
-          <w:position w:val="2"/>
-          <w:sz w:val="18"/>
-        </w:rPr>
-        <w:t xml:space="preserve"> </w:t>
-      </w:r>
-      <w:r>
-        <w:rPr>
-          <w:position w:val="2"/>
-          <w:sz w:val="18"/>
-        </w:rPr>
-        <w:t>this</w:t>
-      </w:r>
-      <w:r>
-        <w:rPr>
-          <w:b/>
-          <w:position w:val="2"/>
-          <w:sz w:val="18"/>
-        </w:rPr>
-        <w:t xml:space="preserve"> </w:t>
+        <w:t xml:space="preserve">Signed and sworn to under the pains and penalties of perjury this </w:t>
       </w:r>
       <w:proofErr w:type="gramStart"/>
       <w:r>
@@ -1643,15 +1336,7 @@
           <w:position w:val="2"/>
           <w:sz w:val="18"/>
         </w:rPr>
-        <w:t>}</w:t>
-      </w:r>
-      <w:r>
-        <w:rPr>
-          <w:bCs/>
-          <w:spacing w:val="-10"/>
-          <w:sz w:val="18"/>
-        </w:rPr>
-        <w:t>,</w:t>
+        <w:t>},</w:t>
       </w:r>
     </w:p>
     <w:p>
@@ -1738,13 +1423,7 @@
         <w:rPr>
           <w:spacing w:val="-2"/>
         </w:rPr>
-        <w:t xml:space="preserve">  </w:t>
-      </w:r>
-      <w:r>
-        <w:rPr>
-          <w:spacing w:val="-2"/>
-        </w:rPr>
-        <w:t xml:space="preserve"> {{ trial_court.address.zip</w:t>
+        <w:t xml:space="preserve">   {{ trial_court.address.zip</w:t>
       </w:r>
       <w:proofErr w:type="gramEnd"/>
       <w:r>
@@ -1801,22 +1480,11 @@
           <w:spacing w:val="-2"/>
         </w:rPr>
         <w:t xml:space="preserve"> }}</w:t>
-      </w:r>
-      <w:r>
-        <w:rPr>
-          <w:spacing w:val="-2"/>
-        </w:rPr>
         <w:tab/>
       </w:r>
       <w:proofErr w:type="gramEnd"/>
       <w:r>
         <w:tab/>
-      </w:r>
-      <w:r>
-        <w:rPr>
-          <w:spacing w:val="-2"/>
-          <w:position w:val="1"/>
-        </w:rPr>
         <w:t>Clerk.</w:t>
       </w:r>
     </w:p>
@@ -2010,67 +1678,29 @@
       </w:r>
       <w:r>
         <w:rPr>
-          <w:rStyle w:val="normaltextrun"/>
-          <w:color w:val="000000"/>
-          <w:sz w:val="18"/>
-          <w:szCs w:val="18"/>
-          <w:shd w:val="clear" w:color="auto" w:fill="FFFFFF"/>
-          <w:lang w:val="en-GB"/>
-        </w:rPr>
-        <w:t>{{ plaintiffs</w:t>
-      </w:r>
-      <w:r>
-        <w:rPr>
-          <w:rStyle w:val="normaltextrun"/>
-          <w:color w:val="000000"/>
-          <w:sz w:val="18"/>
-          <w:szCs w:val="18"/>
-          <w:shd w:val="clear" w:color="auto" w:fill="FFFFFF"/>
-          <w:lang w:val="en-GB"/>
-        </w:rPr>
-        <w:t>[0</w:t>
-      </w:r>
-      <w:r>
-        <w:rPr>
-          <w:rStyle w:val="normaltextrun"/>
-          <w:color w:val="000000"/>
-          <w:sz w:val="18"/>
-          <w:szCs w:val="18"/>
-          <w:shd w:val="clear" w:color="auto" w:fill="FFFFFF"/>
-          <w:lang w:val="en-GB"/>
-        </w:rPr>
-        <w:t>].</w:t>
-      </w:r>
-      <w:r>
-        <w:rPr>
-          <w:rStyle w:val="normaltextrun"/>
-          <w:color w:val="000000"/>
-          <w:sz w:val="18"/>
-          <w:szCs w:val="18"/>
-          <w:shd w:val="clear" w:color="auto" w:fill="FFFFFF"/>
-          <w:lang w:val="en-GB"/>
-        </w:rPr>
-        <w:t>signatur</w:t>
-      </w:r>
-      <w:r>
-        <w:rPr>
-          <w:rStyle w:val="normaltextrun"/>
-          <w:color w:val="000000"/>
-          <w:sz w:val="18"/>
-          <w:szCs w:val="18"/>
-          <w:shd w:val="clear" w:color="auto" w:fill="FFFFFF"/>
-          <w:lang w:val="en-GB"/>
-        </w:rPr>
-        <w:t>e</w:t>
-      </w:r>
-      <w:r>
-        <w:rPr>
-          <w:rStyle w:val="normaltextrun"/>
-          <w:color w:val="000000"/>
-          <w:sz w:val="18"/>
-          <w:szCs w:val="18"/>
-          <w:shd w:val="clear" w:color="auto" w:fill="FFFFFF"/>
-          <w:lang w:val="en-GB"/>
+          <w:rFonts w:ascii="Segoe UI"/>
+          <w:spacing w:val="-4"/>
+          <w:sz w:val="16"/>
+          <w:szCs w:val="16"/>
+        </w:rPr>
+        <w:t xml:space="preserve">{{ </w:t>
+      </w:r>
+      <w:r>
+        <w:rPr>
+          <w:rFonts w:ascii="Segoe UI"/>
+          <w:spacing w:val="-4"/>
+          <w:sz w:val="16"/>
+          <w:szCs w:val="16"/>
+          <w:shd w:val="clear" w:color="auto" w:fill="C7E1DD"/>
+        </w:rPr>
+        <w:t>plaintiffs[0].signature</w:t>
+      </w:r>
+      <w:r>
+        <w:rPr>
+          <w:rFonts w:ascii="Segoe UI"/>
+          <w:spacing w:val="-4"/>
+          <w:sz w:val="16"/>
+          <w:szCs w:val="16"/>
         </w:rPr>
         <w:t xml:space="preserve"> }}</w:t>
       </w:r>
@@ -2120,29 +1750,13 @@
       </w:pPr>
       <w:r>
         <w:tab/>
-      </w:r>
-      <w:r>
         <w:tab/>
-      </w:r>
-      <w:r>
         <w:tab/>
-      </w:r>
-      <w:r>
         <w:tab/>
-      </w:r>
-      <w:r>
         <w:tab/>
-      </w:r>
-      <w:r>
         <w:tab/>
-      </w:r>
-      <w:r>
         <w:tab/>
-      </w:r>
-      <w:r>
         <w:tab/>
-      </w:r>
-      <w:r>
         <w:t xml:space="preserve">       </w:t>
       </w:r>
       <w:proofErr w:type="gramStart"/>
@@ -2171,10 +1785,7 @@
       </w:r>
       <w:proofErr w:type="gramStart"/>
       <w:r>
-        <w:t xml:space="preserve">  </w:t>
-      </w:r>
-      <w:r>
-        <w:t>}</w:t>
+        <w:t xml:space="preserve">  }</w:t>
       </w:r>
       <w:proofErr w:type="gramEnd"/>
       <w:r>
@@ -2216,103 +1827,57 @@
       </w:pPr>
       <w:r>
         <w:rPr/>
-        <w:t>{</w:t>
+        <w:t xml:space="preserve">{{ </w:t>
+      </w:r>
+      <w:r>
+        <w:rPr>
+          <w:shd w:val="clear" w:color="auto" w:fill="C7E1DD"/>
+        </w:rPr>
+        <w:t>plaintiffs[0].address.city</w:t>
       </w:r>
       <w:r>
         <w:rPr/>
-        <w:t>{ plaintiffs</w:t>
+        <w:t xml:space="preserve"> }}</w:t>
       </w:r>
       <w:r>
         <w:rPr/>
-        <w:t>[0</w:t>
+        <w:t xml:space="preserve">      </w:t>
       </w:r>
       <w:r>
         <w:rPr/>
-        <w:t>].</w:t>
+        <w:t xml:space="preserve">{{ </w:t>
+      </w:r>
+      <w:r>
+        <w:rPr>
+          <w:shd w:val="clear" w:color="auto" w:fill="C7E1DD"/>
+        </w:rPr>
+        <w:t>plaintiffs[0].address.zip</w:t>
       </w:r>
       <w:r>
         <w:rPr/>
-        <w:t>address</w:t>
+        <w:t xml:space="preserve"> }}</w:t>
       </w:r>
       <w:r>
         <w:rPr/>
-        <w:t>.</w:t>
+        <w:t xml:space="preserve">    </w:t>
       </w:r>
       <w:r>
         <w:rPr/>
-        <w:t>city</w:t>
+        <w:t xml:space="preserve">{{ </w:t>
+      </w:r>
+      <w:r>
+        <w:rPr>
+          <w:shd w:val="clear" w:color="auto" w:fill="C7E1DD"/>
+        </w:rPr>
+        <w:t>plaintiffs[0].phone_number</w:t>
       </w:r>
       <w:r>
         <w:rPr/>
-        <w:t xml:space="preserve"> }</w:t>
+        <w:t xml:space="preserve"> }}</w:t>
       </w:r>
       <w:r>
         <w:rPr/>
-        <w:t xml:space="preserve">}   </w:t>
-      </w:r>
-      <w:r>
-        <w:rPr/>
-        <w:t xml:space="preserve">   {</w:t>
-      </w:r>
-      <w:r>
-        <w:rPr/>
-        <w:t>{ plaintiffs</w:t>
-      </w:r>
-      <w:r>
-        <w:rPr/>
-        <w:t>[0</w:t>
-      </w:r>
-      <w:r>
-        <w:rPr/>
-        <w:t>].address.zip</w:t>
-      </w:r>
-      <w:r>
-        <w:rPr/>
-        <w:t xml:space="preserve"> </w:t>
-      </w:r>
-      <w:r>
-        <w:rPr/>
-        <w:t xml:space="preserve">}}   </w:t>
-      </w:r>
-      <w:r>
-        <w:rPr/>
-        <w:t xml:space="preserve"> </w:t>
-      </w:r>
-      <w:r>
-        <w:rPr/>
-        <w:t>{{ plaintiffs</w:t>
-      </w:r>
-      <w:r>
-        <w:rPr/>
-        <w:t>[0</w:t>
-      </w:r>
-      <w:r>
-        <w:rPr/>
-        <w:t>].</w:t>
-      </w:r>
-      <w:r>
-        <w:rPr/>
-        <w:t>phone</w:t>
-      </w:r>
-      <w:r>
-        <w:rPr/>
-        <w:t>_</w:t>
-      </w:r>
-      <w:r>
-        <w:rPr/>
-        <w:t>number</w:t>
-      </w:r>
-      <w:r>
-        <w:rPr/>
-        <w:t xml:space="preserve"> </w:t>
-      </w:r>
-      <w:r>
-        <w:rPr/>
-        <w:t>}</w:t>
-      </w:r>
-      <w:r>
-        <w:rPr/>
-        <w:t xml:space="preserve">}                                                                                                       </w:t>
+        <w:t xml:space="preserve">                                                                                                       </w:t>
       </w:r>
       <w:proofErr w:type="gramStart"/>
       <w:proofErr w:type="gramEnd"/>
@@ -4239,6 +3804,66 @@
     </w:sectPr>
   </w:body>
 </w:document>
+</file>
+
+<file path=word/footer1.xml><?xml version="1.0" encoding="utf-8"?>
+<w:ftr xmlns:m="http://schemas.openxmlformats.org/officeDocument/2006/math" xmlns:mc="http://schemas.openxmlformats.org/markup-compatibility/2006" xmlns:mo="http://schemas.microsoft.com/office/mac/office/2008/main" xmlns:mv="urn:schemas-microsoft-com:mac:vml" xmlns:o="urn:schemas-microsoft-com:office:office" xmlns:r="http://schemas.openxmlformats.org/officeDocument/2006/relationships" xmlns:v="urn:schemas-microsoft-com:vml" xmlns:w10="urn:schemas-microsoft-com:office:word" xmlns:w14="http://schemas.microsoft.com/office/word/2010/wordml" xmlns:w="http://schemas.openxmlformats.org/wordprocessingml/2006/main" xmlns:wne="http://schemas.microsoft.com/office/word/2006/wordml" xmlns:wp14="http://schemas.microsoft.com/office/word/2010/wordprocessingDrawing" xmlns:wp="http://schemas.openxmlformats.org/drawingml/2006/wordprocessingDrawing" xmlns:wpc="http://schemas.microsoft.com/office/word/2010/wordprocessingCanvas" xmlns:wpg="http://schemas.microsoft.com/office/word/2010/wordprocessingGroup" xmlns:wpi="http://schemas.microsoft.com/office/word/2010/wordprocessingInk" xmlns:wps="http://schemas.microsoft.com/office/word/2010/wordprocessingShape" mc:Ignorable="w14 wp14">
+  <w:p>
+    <w:pPr>
+      <w:pStyle w:val="Footer"/>
+    </w:pPr>
+  </w:p>
+</w:ftr>
+</file>
+
+<file path=word/footer2.xml><?xml version="1.0" encoding="utf-8"?>
+<w:ftr xmlns:m="http://schemas.openxmlformats.org/officeDocument/2006/math" xmlns:mc="http://schemas.openxmlformats.org/markup-compatibility/2006" xmlns:mo="http://schemas.microsoft.com/office/mac/office/2008/main" xmlns:mv="urn:schemas-microsoft-com:mac:vml" xmlns:o="urn:schemas-microsoft-com:office:office" xmlns:r="http://schemas.openxmlformats.org/officeDocument/2006/relationships" xmlns:v="urn:schemas-microsoft-com:vml" xmlns:w10="urn:schemas-microsoft-com:office:word" xmlns:w14="http://schemas.microsoft.com/office/word/2010/wordml" xmlns:w="http://schemas.openxmlformats.org/wordprocessingml/2006/main" xmlns:wne="http://schemas.microsoft.com/office/word/2006/wordml" xmlns:wp14="http://schemas.microsoft.com/office/word/2010/wordprocessingDrawing" xmlns:wp="http://schemas.openxmlformats.org/drawingml/2006/wordprocessingDrawing" xmlns:wpc="http://schemas.microsoft.com/office/word/2010/wordprocessingCanvas" xmlns:wpg="http://schemas.microsoft.com/office/word/2010/wordprocessingGroup" xmlns:wpi="http://schemas.microsoft.com/office/word/2010/wordprocessingInk" xmlns:wps="http://schemas.microsoft.com/office/word/2010/wordprocessingShape" mc:Ignorable="w14 wp14">
+  <w:p>
+    <w:pPr>
+      <w:pStyle w:val="Footer"/>
+    </w:pPr>
+  </w:p>
+</w:ftr>
+</file>
+
+<file path=word/footer3.xml><?xml version="1.0" encoding="utf-8"?>
+<w:ftr xmlns:m="http://schemas.openxmlformats.org/officeDocument/2006/math" xmlns:mc="http://schemas.openxmlformats.org/markup-compatibility/2006" xmlns:mo="http://schemas.microsoft.com/office/mac/office/2008/main" xmlns:mv="urn:schemas-microsoft-com:mac:vml" xmlns:o="urn:schemas-microsoft-com:office:office" xmlns:r="http://schemas.openxmlformats.org/officeDocument/2006/relationships" xmlns:v="urn:schemas-microsoft-com:vml" xmlns:w10="urn:schemas-microsoft-com:office:word" xmlns:w14="http://schemas.microsoft.com/office/word/2010/wordml" xmlns:w="http://schemas.openxmlformats.org/wordprocessingml/2006/main" xmlns:wne="http://schemas.microsoft.com/office/word/2006/wordml" xmlns:wp14="http://schemas.microsoft.com/office/word/2010/wordprocessingDrawing" xmlns:wp="http://schemas.openxmlformats.org/drawingml/2006/wordprocessingDrawing" xmlns:wpc="http://schemas.microsoft.com/office/word/2010/wordprocessingCanvas" xmlns:wpg="http://schemas.microsoft.com/office/word/2010/wordprocessingGroup" xmlns:wpi="http://schemas.microsoft.com/office/word/2010/wordprocessingInk" xmlns:wps="http://schemas.microsoft.com/office/word/2010/wordprocessingShape" mc:Ignorable="w14 wp14">
+  <w:p>
+    <w:pPr>
+      <w:pStyle w:val="Footer"/>
+    </w:pPr>
+  </w:p>
+</w:ftr>
+</file>
+
+<file path=word/header1.xml><?xml version="1.0" encoding="utf-8"?>
+<w:hdr xmlns:m="http://schemas.openxmlformats.org/officeDocument/2006/math" xmlns:mc="http://schemas.openxmlformats.org/markup-compatibility/2006" xmlns:mo="http://schemas.microsoft.com/office/mac/office/2008/main" xmlns:mv="urn:schemas-microsoft-com:mac:vml" xmlns:o="urn:schemas-microsoft-com:office:office" xmlns:r="http://schemas.openxmlformats.org/officeDocument/2006/relationships" xmlns:v="urn:schemas-microsoft-com:vml" xmlns:w10="urn:schemas-microsoft-com:office:word" xmlns:w14="http://schemas.microsoft.com/office/word/2010/wordml" xmlns:w="http://schemas.openxmlformats.org/wordprocessingml/2006/main" xmlns:wne="http://schemas.microsoft.com/office/word/2006/wordml" xmlns:wp14="http://schemas.microsoft.com/office/word/2010/wordprocessingDrawing" xmlns:wp="http://schemas.openxmlformats.org/drawingml/2006/wordprocessingDrawing" xmlns:wpc="http://schemas.microsoft.com/office/word/2010/wordprocessingCanvas" xmlns:wpg="http://schemas.microsoft.com/office/word/2010/wordprocessingGroup" xmlns:wpi="http://schemas.microsoft.com/office/word/2010/wordprocessingInk" xmlns:wps="http://schemas.microsoft.com/office/word/2010/wordprocessingShape" mc:Ignorable="w14 wp14">
+  <w:p>
+    <w:pPr>
+      <w:pStyle w:val="Header"/>
+    </w:pPr>
+  </w:p>
+</w:hdr>
+</file>
+
+<file path=word/header2.xml><?xml version="1.0" encoding="utf-8"?>
+<w:hdr xmlns:m="http://schemas.openxmlformats.org/officeDocument/2006/math" xmlns:mc="http://schemas.openxmlformats.org/markup-compatibility/2006" xmlns:mo="http://schemas.microsoft.com/office/mac/office/2008/main" xmlns:mv="urn:schemas-microsoft-com:mac:vml" xmlns:o="urn:schemas-microsoft-com:office:office" xmlns:r="http://schemas.openxmlformats.org/officeDocument/2006/relationships" xmlns:v="urn:schemas-microsoft-com:vml" xmlns:w10="urn:schemas-microsoft-com:office:word" xmlns:w14="http://schemas.microsoft.com/office/word/2010/wordml" xmlns:w="http://schemas.openxmlformats.org/wordprocessingml/2006/main" xmlns:wne="http://schemas.microsoft.com/office/word/2006/wordml" xmlns:wp14="http://schemas.microsoft.com/office/word/2010/wordprocessingDrawing" xmlns:wp="http://schemas.openxmlformats.org/drawingml/2006/wordprocessingDrawing" xmlns:wpc="http://schemas.microsoft.com/office/word/2010/wordprocessingCanvas" xmlns:wpg="http://schemas.microsoft.com/office/word/2010/wordprocessingGroup" xmlns:wpi="http://schemas.microsoft.com/office/word/2010/wordprocessingInk" xmlns:wps="http://schemas.microsoft.com/office/word/2010/wordprocessingShape" mc:Ignorable="w14 wp14">
+  <w:p>
+    <w:pPr>
+      <w:pStyle w:val="Header"/>
+    </w:pPr>
+  </w:p>
+</w:hdr>
+</file>
+
+<file path=word/header3.xml><?xml version="1.0" encoding="utf-8"?>
+<w:hdr xmlns:m="http://schemas.openxmlformats.org/officeDocument/2006/math" xmlns:mc="http://schemas.openxmlformats.org/markup-compatibility/2006" xmlns:mo="http://schemas.microsoft.com/office/mac/office/2008/main" xmlns:mv="urn:schemas-microsoft-com:mac:vml" xmlns:o="urn:schemas-microsoft-com:office:office" xmlns:r="http://schemas.openxmlformats.org/officeDocument/2006/relationships" xmlns:v="urn:schemas-microsoft-com:vml" xmlns:w10="urn:schemas-microsoft-com:office:word" xmlns:w14="http://schemas.microsoft.com/office/word/2010/wordml" xmlns:w="http://schemas.openxmlformats.org/wordprocessingml/2006/main" xmlns:wne="http://schemas.microsoft.com/office/word/2006/wordml" xmlns:wp14="http://schemas.microsoft.com/office/word/2010/wordprocessingDrawing" xmlns:wp="http://schemas.openxmlformats.org/drawingml/2006/wordprocessingDrawing" xmlns:wpc="http://schemas.microsoft.com/office/word/2010/wordprocessingCanvas" xmlns:wpg="http://schemas.microsoft.com/office/word/2010/wordprocessingGroup" xmlns:wpi="http://schemas.microsoft.com/office/word/2010/wordprocessingInk" xmlns:wps="http://schemas.microsoft.com/office/word/2010/wordprocessingShape" mc:Ignorable="w14 wp14">
+  <w:p>
+    <w:pPr>
+      <w:pStyle w:val="Header"/>
+    </w:pPr>
+  </w:p>
+</w:hdr>
 </file>
 
 <file path=word/styles.xml><?xml version="1.0" encoding="utf-8"?>

</xml_diff>

<commit_message>
updated some spaces on the TRO form
</commit_message>
<xml_diff>
--- a/docassemble/MAHousingTRO/data/templates/temporary_restraining_order.docx
+++ b/docassemble/MAHousingTRO/data/templates/temporary_restraining_order.docx
@@ -1102,7 +1102,7 @@
           <w:sz w:val="18"/>
           <w:szCs w:val="18"/>
         </w:rPr>
-        <w:t xml:space="preserve">   </w:t>
+        <w:tab/>
       </w:r>
       <w:r>
         <w:rPr>
@@ -1126,6 +1126,14 @@
           <w:sz w:val="18"/>
           <w:szCs w:val="18"/>
         </w:rPr>
+        <w:tab/>
+      </w:r>
+      <w:r>
+        <w:rPr>
+          <w:rFonts w:ascii="Arial" w:hAnsi="Arial" w:cs="Arial"/>
+          <w:sz w:val="18"/>
+          <w:szCs w:val="18"/>
+        </w:rPr>
         <w:t>{{ plaintiffs[0].phone_number }}</w:t>
       </w:r>
     </w:p>
@@ -1160,7 +1168,23 @@
           <w:sz w:val="18"/>
           <w:szCs w:val="18"/>
         </w:rPr>
-        <w:t xml:space="preserve">         </w:t>
+        <w:t xml:space="preserve">       </w:t>
+      </w:r>
+      <w:r>
+        <w:rPr>
+          <w:rFonts w:ascii="Arial" w:hAnsi="Arial" w:cs="Arial"/>
+          <w:sz w:val="18"/>
+          <w:szCs w:val="18"/>
+        </w:rPr>
+        <w:tab/>
+      </w:r>
+      <w:r>
+        <w:rPr>
+          <w:rFonts w:ascii="Arial" w:hAnsi="Arial" w:cs="Arial"/>
+          <w:sz w:val="18"/>
+          <w:szCs w:val="18"/>
+        </w:rPr>
+        <w:t xml:space="preserve">  </w:t>
       </w:r>
       <w:r>
         <w:rPr>

</xml_diff>